<commit_message>
Redesign Phase 2 around transfer before any Phase 2 data
- Split H3 into H3-T (a jointly trained trust head transfers across
  datasets better than a frozen head; primary) and H3-J (the joint
  objective beats trust-only fine-tuning; secondary). Each needs a win
  with the CI excluding zero in both transfer directions, plus the
  generation-quality bar.
- Fix in advance how a tie between joint and trust-only training is
  read: "generation-preserving trust training" only if trust-only
  fails the generation bar and joint training meets it.
- Train on TriviaQA and on SQuAD (Phase 1 splits, rule v3 labels)
  instead of TriviaQA + NQ-Open; read the trust head from 50% depth;
  report refusals separately. Update the decision table.
- Bring the theory paper's hypothesis table and staging in line.
</commit_message>
<xml_diff>
--- a/paper/TCL-Theory-Paper-v2.docx
+++ b/paper/TCL-Theory-Paper-v2.docx
@@ -3566,29 +3566,64 @@
               <w:pStyle w:val="Compact"/>
             </w:pPr>
             <w:r>
-              <w:t xml:space="preserve">H3</w:t>
-            </w:r>
-          </w:p>
-        </w:tc>
-        <w:tc>
-          <w:tcPr/>
-          <w:p>
-            <w:pPr>
-              <w:pStyle w:val="Compact"/>
-            </w:pPr>
-            <w:r>
-              <w:t xml:space="preserve">Joint training beats a frozen head trained on identical data, at equal generation quality.</w:t>
-            </w:r>
-          </w:p>
-        </w:tc>
-        <w:tc>
-          <w:tcPr/>
-          <w:p>
-            <w:pPr>
-              <w:pStyle w:val="Compact"/>
-            </w:pPr>
-            <w:r>
-              <w:t xml:space="preserve">TCL-J beats arms A and B (below) on AUROC with CI excluding zero on at least 2 of 3 evaluation sets, with answer-accuracy drop of at most 1 point and held-out perplexity increase of at most 3%.</w:t>
+              <w:t xml:space="preserve">H3-T (primary)</w:t>
+            </w:r>
+          </w:p>
+        </w:tc>
+        <w:tc>
+          <w:tcPr/>
+          <w:p>
+            <w:pPr>
+              <w:pStyle w:val="Compact"/>
+            </w:pPr>
+            <w:r>
+              <w:t xml:space="preserve">A jointly trained trust head transfers across datasets better than a frozen head trained on identical data.</w:t>
+            </w:r>
+          </w:p>
+        </w:tc>
+        <w:tc>
+          <w:tcPr/>
+          <w:p>
+            <w:pPr>
+              <w:pStyle w:val="Compact"/>
+            </w:pPr>
+            <w:r>
+              <w:t xml:space="preserve">Trained on TriviaQA and tested on SQuAD, and the reverse: TCL-J’s AUROC exceeds arm A’s with CI excluding zero in both directions, and TCL-J meets the generation-quality bar (answer-accuracy drop of at most 1 point, held-out perplexity increase of at most 3%).</w:t>
+            </w:r>
+          </w:p>
+        </w:tc>
+      </w:tr>
+      <w:tr>
+        <w:tc>
+          <w:tcPr/>
+          <w:p>
+            <w:pPr>
+              <w:pStyle w:val="Compact"/>
+            </w:pPr>
+            <w:r>
+              <w:t xml:space="preserve">H3-J (secondary)</w:t>
+            </w:r>
+          </w:p>
+        </w:tc>
+        <w:tc>
+          <w:tcPr/>
+          <w:p>
+            <w:pPr>
+              <w:pStyle w:val="Compact"/>
+            </w:pPr>
+            <w:r>
+              <w:t xml:space="preserve">The joint objective beats trust-only fine-tuning, at equal or better generation quality.</w:t>
+            </w:r>
+          </w:p>
+        </w:tc>
+        <w:tc>
+          <w:tcPr/>
+          <w:p>
+            <w:pPr>
+              <w:pStyle w:val="Compact"/>
+            </w:pPr>
+            <w:r>
+              <w:t xml:space="preserve">Same transfer test: TCL-J’s AUROC exceeds arm B’s with CI excluding zero in both directions, and TCL-J meets the generation-quality bar.</w:t>
             </w:r>
           </w:p>
         </w:tc>
@@ -3716,17 +3751,17 @@
         <w:pStyle w:val="BodyText"/>
       </w:pPr>
       <w:r>
-        <w:t xml:space="preserve">H3 is the core test of TCL. H1 and H2 concern the frozen foundation; H4-H6 extend the framework.</w:t>
+        <w:t xml:space="preserve">H3 is the core test of TCL. Transfer (H3-T) is primary because frozen probes fail to transfer (Orgad et al., 2025; Phase 1 of this program), so that is where a trained head can show an advantage. H1 and H2 concern the frozen foundation; H4-H6 extend the framework.</w:t>
       </w:r>
     </w:p>
     <w:bookmarkEnd w:id="36"/>
-    <w:bookmarkStart w:id="37" w:name="experimental-arms-for-h3"/>
+    <w:bookmarkStart w:id="37" w:name="experimental-arms-for-h3-t-and-h3-j"/>
     <w:p>
       <w:pPr>
         <w:pStyle w:val="Heading3"/>
       </w:pPr>
       <w:r>
-        <w:t xml:space="preserve">8.2 Experimental Arms for H3</w:t>
+        <w:t xml:space="preserve">8.2 Experimental Arms for H3-T and H3-J</w:t>
       </w:r>
     </w:p>
     <w:p>
@@ -4038,6 +4073,24 @@
         <w:t xml:space="preserve">If C beats A but not B, the benefit comes from adapting the backbone, not from the joint objective. If C beats A and B but D matches C, the benefit comes from LM fine-tuning. Only if C beats all three does the evidence support the joint objective specifically.</w:t>
       </w:r>
     </w:p>
+    <w:p>
+      <w:pPr>
+        <w:pStyle w:val="BodyText"/>
+      </w:pPr>
+      <w:r>
+        <w:rPr>
+          <w:b/>
+          <w:bCs/>
+        </w:rPr>
+        <w:t xml:space="preserve">Reading a tie between C and B (fixed in advance).</w:t>
+      </w:r>
+      <w:r>
+        <w:t xml:space="preserve"> </w:t>
+      </w:r>
+      <w:r>
+        <w:t xml:space="preserve">If C and B are indistinguishable on trust but B fails the generation-quality bar while C meets it, the joint objective’s role is to preserve generation while training for trust, and I claim no more than that. If both meet the bar and tie, the joint objective adds nothing measurable beyond trust-only fine-tuning at this scale.</w:t>
+      </w:r>
+    </w:p>
     <w:bookmarkEnd w:id="37"/>
     <w:bookmarkStart w:id="38" w:name="metrics"/>
     <w:p>
@@ -4396,7 +4449,7 @@
         </w:numPr>
       </w:pPr>
       <w:r>
-        <w:t xml:space="preserve">Test H3 on Qwen2.5-0.5B-Instruct with LoRA, correctness dimension only.</w:t>
+        <w:t xml:space="preserve">Test H3-T and H3-J on Qwen2.5-0.5B-Instruct with LoRA, correctness dimension only, training on TriviaQA and on SQuAD and testing transfer between them.</w:t>
       </w:r>
     </w:p>
     <w:p>
@@ -4440,7 +4493,7 @@
         <w:pStyle w:val="FirstParagraph"/>
       </w:pPr>
       <w:r>
-        <w:t xml:space="preserve">Each stage begins only after the previous stage’s gate has been evaluated. If H3 fails, TCL continues as a frozen multi-dimensional trust head (TCL-F), and its value must come from H4 and H5.</w:t>
+        <w:t xml:space="preserve">Each stage begins only after the previous stage’s gate has been evaluated. If H3-T fails, TCL continues as a frozen multi-dimensional trust head (TCL-F), and its value must come from H4 and H5.</w:t>
       </w:r>
     </w:p>
     <w:bookmarkEnd w:id="41"/>

</xml_diff>